<commit_message>
fix(NFR-042): include complete final priority group
</commit_message>
<xml_diff>
--- a/resolutions/RESOLUTON-OF-ISSUE-NFR-042.docx
+++ b/resolutions/RESOLUTON-OF-ISSUE-NFR-042.docx
@@ -193,7 +193,7 @@
     </w:p>
     <w:p>
       <w:r>
-        <w:t>README.md stated that BUGS.md was authoritative but reordered NFR-003 and NFR-009–013 ahead of applicant-media work and omitted three active backlog groups.</w:t>
+        <w:t>README.md stated that BUGS.md was authoritative but reordered active work, omitted three active backlog groups, and then omitted the final group’s “remaining specification gaps” tail in its first correction.</w:t>
       </w:r>
     </w:p>
     <w:p>
@@ -219,7 +219,7 @@
     </w:p>
     <w:p>
       <w:r>
-        <w:t>README now mirrors the complete active BUGS.md sequence before continued NFR-FEAT-001 work. BUGS.md records NFR-042 and removes it from the active queue as resolved.</w:t>
+        <w:t>README now mirrors the complete active BUGS.md sequence—including the final specification-gap tail—before continued NFR-FEAT-001 work. The resolution used two bounded correction iterations.</w:t>
       </w:r>
     </w:p>
     <w:p>
@@ -245,7 +245,7 @@
     </w:p>
     <w:p>
       <w:r>
-        <w:t>Both NFR-042 tests failed before the fix: one on NFR-008/media/NFR-003 order and one on missing NFR-007/005/006, NFR-009–013, and NFR-014–019 groups. Both pass after the first implementation iteration.</w:t>
+        <w:t>Two NFR-042 tests failed before the first fix: one on NFR-008/media/NFR-003 order and one on omitted active groups. After merge, an expanded assertion failed on the missing “remaining specification gaps” tail. All assertions pass after correction iteration 2 of the permitted 3.</w:t>
       </w:r>
     </w:p>
     <w:p>
@@ -271,7 +271,7 @@
     </w:p>
     <w:p>
       <w:r>
-        <w:t>Review README and BUGS.md together; file the next NFR ID if priority order or evidence diverges.</w:t>
+        <w:t>The first post-merge review found the missing final-group tail and triggered correction iteration 2. The follow-up review must compare README and BUGS.md together and file a new ID only for a distinct defect.</w:t>
       </w:r>
     </w:p>
     <w:p>

</xml_diff>